<commit_message>
docs: remove 方案C (event logging) from section 2.1 of tutorial DOCX
Section 2.1 now shows two on-chain approaches only (A: contract storage,
B: calldata). Removed 方案C (emit AgentMetadata event log) and updated
section title from 三种 to 两种.

Co-Authored-By: Claude Sonnet 4.6 <noreply@anthropic.com>
</commit_message>
<xml_diff>
--- a/doc/bnbchain-garden-agent-tutorial/BNBChain-Garden-Agent接入教程(含ERC-8004).docx
+++ b/doc/bnbchain-garden-agent-tutorial/BNBChain-Garden-Agent接入教程(含ERC-8004).docx
@@ -423,7 +423,7 @@
           <w:sz w:val="28"/>
           <w:szCs w:val="28"/>
         </w:rPr>
-        <w:t xml:space="preserve">2.1 三种链上方案对比</w:t>
+        <w:t xml:space="preserve">2.1 两种链上方案对比</w:t>
       </w:r>
     </w:p>
     <w:tbl>
@@ -815,131 +815,6 @@
                 <w:szCs w:val="20"/>
               </w:rPr>
               <w:t xml:space="preserve">低（calldata 不写 storage）</w:t>
-            </w:r>
-          </w:p>
-        </w:tc>
-      </w:tr>
-      <w:tr>
-        <w:trPr>
-          <w:tblHeader w:val="false"/>
-        </w:trPr>
-        <w:tc>
-          <w:tcPr>
-            <w:tcW w:type="dxa" w:w="1800"/>
-            <w:tcBorders>
-              <w:top w:val="single" w:color="CCCCCC" w:sz="1"/>
-              <w:left w:val="single" w:color="CCCCCC" w:sz="1"/>
-              <w:bottom w:val="single" w:color="CCCCCC" w:sz="1"/>
-              <w:right w:val="single" w:color="CCCCCC" w:sz="1"/>
-            </w:tcBorders>
-            <w:shd w:fill="FFFFFF" w:val="clear"/>
-            <w:tcMar>
-              <w:top w:type="dxa" w:w="80"/>
-              <w:left w:type="dxa" w:w="120"/>
-              <w:bottom w:type="dxa" w:w="80"/>
-              <w:right w:type="dxa" w:w="120"/>
-            </w:tcMar>
-          </w:tcPr>
-          <w:p>
-            <w:r>
-              <w:rPr>
-                <w:rFonts w:ascii="Arial" w:cs="Arial" w:eastAsia="Arial" w:hAnsi="Arial"/>
-                <w:b w:val="false"/>
-                <w:bCs w:val="false"/>
-                <w:sz w:val="20"/>
-                <w:szCs w:val="20"/>
-              </w:rPr>
-              <w:t xml:space="preserve">C — 事件存档</w:t>
-            </w:r>
-          </w:p>
-        </w:tc>
-        <w:tc>
-          <w:tcPr>
-            <w:tcW w:type="dxa" w:w="3600"/>
-            <w:tcBorders>
-              <w:top w:val="single" w:color="CCCCCC" w:sz="1"/>
-              <w:left w:val="single" w:color="CCCCCC" w:sz="1"/>
-              <w:bottom w:val="single" w:color="CCCCCC" w:sz="1"/>
-              <w:right w:val="single" w:color="CCCCCC" w:sz="1"/>
-            </w:tcBorders>
-            <w:shd w:fill="FFFFFF" w:val="clear"/>
-            <w:tcMar>
-              <w:top w:type="dxa" w:w="80"/>
-              <w:left w:type="dxa" w:w="120"/>
-              <w:bottom w:type="dxa" w:w="80"/>
-              <w:right w:type="dxa" w:w="120"/>
-            </w:tcMar>
-          </w:tcPr>
-          <w:p>
-            <w:r>
-              <w:rPr>
-                <w:rFonts w:ascii="Arial" w:cs="Arial" w:eastAsia="Arial" w:hAnsi="Arial"/>
-                <w:b w:val="false"/>
-                <w:bCs w:val="false"/>
-                <w:sz w:val="20"/>
-                <w:szCs w:val="20"/>
-              </w:rPr>
-              <w:t xml:space="preserve">emit AgentMetadata(json) 写入日志</w:t>
-            </w:r>
-          </w:p>
-        </w:tc>
-        <w:tc>
-          <w:tcPr>
-            <w:tcW w:type="dxa" w:w="2280"/>
-            <w:tcBorders>
-              <w:top w:val="single" w:color="CCCCCC" w:sz="1"/>
-              <w:left w:val="single" w:color="CCCCCC" w:sz="1"/>
-              <w:bottom w:val="single" w:color="CCCCCC" w:sz="1"/>
-              <w:right w:val="single" w:color="CCCCCC" w:sz="1"/>
-            </w:tcBorders>
-            <w:shd w:fill="FFFFFF" w:val="clear"/>
-            <w:tcMar>
-              <w:top w:type="dxa" w:w="80"/>
-              <w:left w:type="dxa" w:w="120"/>
-              <w:bottom w:type="dxa" w:w="80"/>
-              <w:right w:type="dxa" w:w="120"/>
-            </w:tcMar>
-          </w:tcPr>
-          <w:p>
-            <w:r>
-              <w:rPr>
-                <w:rFonts w:ascii="Arial" w:cs="Arial" w:eastAsia="Arial" w:hAnsi="Arial"/>
-                <w:b w:val="false"/>
-                <w:bCs w:val="false"/>
-                <w:sz w:val="20"/>
-                <w:szCs w:val="20"/>
-              </w:rPr>
-              <w:t xml:space="preserve">对 Gas 极度敏感，有自建索引器</w:t>
-            </w:r>
-          </w:p>
-        </w:tc>
-        <w:tc>
-          <w:tcPr>
-            <w:tcW w:type="dxa" w:w="1680"/>
-            <w:tcBorders>
-              <w:top w:val="single" w:color="CCCCCC" w:sz="1"/>
-              <w:left w:val="single" w:color="CCCCCC" w:sz="1"/>
-              <w:bottom w:val="single" w:color="CCCCCC" w:sz="1"/>
-              <w:right w:val="single" w:color="CCCCCC" w:sz="1"/>
-            </w:tcBorders>
-            <w:shd w:fill="FFFFFF" w:val="clear"/>
-            <w:tcMar>
-              <w:top w:type="dxa" w:w="80"/>
-              <w:left w:type="dxa" w:w="120"/>
-              <w:bottom w:type="dxa" w:w="80"/>
-              <w:right w:type="dxa" w:w="120"/>
-            </w:tcMar>
-          </w:tcPr>
-          <w:p>
-            <w:r>
-              <w:rPr>
-                <w:rFonts w:ascii="Arial" w:cs="Arial" w:eastAsia="Arial" w:hAnsi="Arial"/>
-                <w:b w:val="false"/>
-                <w:bCs w:val="false"/>
-                <w:sz w:val="20"/>
-                <w:szCs w:val="20"/>
-              </w:rPr>
-              <w:t xml:space="preserve">极低</w:t>
             </w:r>
           </w:p>
         </w:tc>

</xml_diff>